<commit_message>
Added regex messages to all constants files and updated create-post.dto.ts.
</commit_message>
<xml_diff>
--- a/Portal_Database_Design/APIs/Post_APIs.docx
+++ b/Portal_Database_Design/APIs/Post_APIs.docx
@@ -20,8 +20,8 @@
         <w:gridCol w:w="1573"/>
         <w:gridCol w:w="1601"/>
         <w:gridCol w:w="1612"/>
-        <w:gridCol w:w="1607"/>
-        <w:gridCol w:w="1605"/>
+        <w:gridCol w:w="1608"/>
+        <w:gridCol w:w="1604"/>
       </w:tblGrid>
       <w:tr>
         <w:trPr/>
@@ -223,7 +223,7 @@
         </w:tc>
         <w:tc>
           <w:tcPr>
-            <w:tcW w:w="1607" w:type="dxa"/>
+            <w:tcW w:w="1608" w:type="dxa"/>
             <w:tcBorders>
               <w:top w:val="single" w:sz="4" w:space="0" w:color="000000"/>
               <w:start w:val="single" w:sz="4" w:space="0" w:color="000000"/>
@@ -272,7 +272,7 @@
         </w:tc>
         <w:tc>
           <w:tcPr>
-            <w:tcW w:w="1605" w:type="dxa"/>
+            <w:tcW w:w="1604" w:type="dxa"/>
             <w:tcBorders>
               <w:top w:val="single" w:sz="4" w:space="0" w:color="000000"/>
               <w:start w:val="single" w:sz="4" w:space="0" w:color="000000"/>
@@ -405,7 +405,7 @@
         </w:tc>
         <w:tc>
           <w:tcPr>
-            <w:tcW w:w="1607" w:type="dxa"/>
+            <w:tcW w:w="1608" w:type="dxa"/>
             <w:tcBorders>
               <w:start w:val="single" w:sz="4" w:space="0" w:color="000000"/>
             </w:tcBorders>
@@ -425,7 +425,7 @@
         </w:tc>
         <w:tc>
           <w:tcPr>
-            <w:tcW w:w="1605" w:type="dxa"/>
+            <w:tcW w:w="1604" w:type="dxa"/>
             <w:tcBorders>
               <w:start w:val="single" w:sz="4" w:space="0" w:color="000000"/>
               <w:end w:val="single" w:sz="4" w:space="0" w:color="000000"/>
@@ -529,7 +529,7 @@
         </w:tc>
         <w:tc>
           <w:tcPr>
-            <w:tcW w:w="1607" w:type="dxa"/>
+            <w:tcW w:w="1608" w:type="dxa"/>
             <w:tcBorders>
               <w:start w:val="single" w:sz="4" w:space="0" w:color="000000"/>
             </w:tcBorders>
@@ -549,7 +549,7 @@
         </w:tc>
         <w:tc>
           <w:tcPr>
-            <w:tcW w:w="1605" w:type="dxa"/>
+            <w:tcW w:w="1604" w:type="dxa"/>
             <w:tcBorders>
               <w:start w:val="single" w:sz="4" w:space="0" w:color="000000"/>
               <w:end w:val="single" w:sz="4" w:space="0" w:color="000000"/>
@@ -655,7 +655,7 @@
         </w:tc>
         <w:tc>
           <w:tcPr>
-            <w:tcW w:w="1607" w:type="dxa"/>
+            <w:tcW w:w="1608" w:type="dxa"/>
             <w:tcBorders>
               <w:start w:val="single" w:sz="4" w:space="0" w:color="000000"/>
             </w:tcBorders>
@@ -675,7 +675,7 @@
         </w:tc>
         <w:tc>
           <w:tcPr>
-            <w:tcW w:w="1605" w:type="dxa"/>
+            <w:tcW w:w="1604" w:type="dxa"/>
             <w:tcBorders>
               <w:start w:val="single" w:sz="4" w:space="0" w:color="000000"/>
               <w:end w:val="single" w:sz="4" w:space="0" w:color="000000"/>
@@ -779,7 +779,7 @@
         </w:tc>
         <w:tc>
           <w:tcPr>
-            <w:tcW w:w="1607" w:type="dxa"/>
+            <w:tcW w:w="1608" w:type="dxa"/>
             <w:tcBorders>
               <w:start w:val="single" w:sz="4" w:space="0" w:color="000000"/>
             </w:tcBorders>
@@ -799,7 +799,7 @@
         </w:tc>
         <w:tc>
           <w:tcPr>
-            <w:tcW w:w="1605" w:type="dxa"/>
+            <w:tcW w:w="1604" w:type="dxa"/>
             <w:tcBorders>
               <w:start w:val="single" w:sz="4" w:space="0" w:color="000000"/>
               <w:end w:val="single" w:sz="4" w:space="0" w:color="000000"/>
@@ -903,7 +903,7 @@
         </w:tc>
         <w:tc>
           <w:tcPr>
-            <w:tcW w:w="1607" w:type="dxa"/>
+            <w:tcW w:w="1608" w:type="dxa"/>
             <w:tcBorders>
               <w:start w:val="single" w:sz="4" w:space="0" w:color="000000"/>
             </w:tcBorders>
@@ -923,7 +923,7 @@
         </w:tc>
         <w:tc>
           <w:tcPr>
-            <w:tcW w:w="1605" w:type="dxa"/>
+            <w:tcW w:w="1604" w:type="dxa"/>
             <w:tcBorders>
               <w:start w:val="single" w:sz="4" w:space="0" w:color="000000"/>
               <w:end w:val="single" w:sz="4" w:space="0" w:color="000000"/>
@@ -936,8 +936,8 @@
               <w:jc w:val="start"/>
               <w:rPr/>
             </w:pPr>
-            <w:bookmarkStart w:id="1" w:name="__DdeLink__236_3812019263"/>
-            <w:bookmarkStart w:id="2" w:name="__DdeLink__198_1713557497"/>
+            <w:bookmarkStart w:id="1" w:name="__DdeLink__198_1713557497"/>
+            <w:bookmarkStart w:id="2" w:name="__DdeLink__236_3812019263"/>
             <w:r>
               <w:rPr/>
               <w:t xml:space="preserve">A user </w:t>
@@ -1059,7 +1059,7 @@
         </w:tc>
         <w:tc>
           <w:tcPr>
-            <w:tcW w:w="1607" w:type="dxa"/>
+            <w:tcW w:w="1608" w:type="dxa"/>
             <w:tcBorders>
               <w:start w:val="single" w:sz="4" w:space="0" w:color="000000"/>
             </w:tcBorders>
@@ -1079,7 +1079,7 @@
         </w:tc>
         <w:tc>
           <w:tcPr>
-            <w:tcW w:w="1605" w:type="dxa"/>
+            <w:tcW w:w="1604" w:type="dxa"/>
             <w:tcBorders>
               <w:start w:val="single" w:sz="4" w:space="0" w:color="000000"/>
               <w:end w:val="single" w:sz="4" w:space="0" w:color="000000"/>
@@ -1094,7 +1094,18 @@
             </w:pPr>
             <w:r>
               <w:rPr/>
-              <w:t>A user regardless of their user_role can find all posts that are related to their outlet. chain_managers can see all posts related to all outlets of their chains. CAPABILITY to be added in authentication and authorization phase.</w:t>
+              <w:t xml:space="preserve">A user regardless of their user_role can find all posts that are related to their outlet. </w:t>
+            </w:r>
+            <w:r>
+              <w:rPr>
+                <w:b/>
+                <w:bCs/>
+              </w:rPr>
+              <w:t>chain_managers can see all posts related to all outlets of their chains</w:t>
+            </w:r>
+            <w:r>
+              <w:rPr/>
+              <w:t>. CAPABILITY to be added in authentication and authorization phase.</w:t>
             </w:r>
           </w:p>
         </w:tc>
@@ -1183,7 +1194,7 @@
         </w:tc>
         <w:tc>
           <w:tcPr>
-            <w:tcW w:w="1607" w:type="dxa"/>
+            <w:tcW w:w="1608" w:type="dxa"/>
             <w:tcBorders>
               <w:start w:val="single" w:sz="4" w:space="0" w:color="000000"/>
             </w:tcBorders>
@@ -1203,7 +1214,7 @@
         </w:tc>
         <w:tc>
           <w:tcPr>
-            <w:tcW w:w="1605" w:type="dxa"/>
+            <w:tcW w:w="1604" w:type="dxa"/>
             <w:tcBorders>
               <w:start w:val="single" w:sz="4" w:space="0" w:color="000000"/>
               <w:end w:val="single" w:sz="4" w:space="0" w:color="000000"/>
@@ -1218,7 +1229,18 @@
             </w:pPr>
             <w:r>
               <w:rPr/>
-              <w:t>A user regardless of their user_role can find all posts that are related to their outlet. chain_managers can see all posts related to all outlets of their chains. CAPABILITY to be added in authentication and authorization phase.</w:t>
+              <w:t xml:space="preserve">A user regardless of their user_role can find all posts that are related to their outlet. </w:t>
+            </w:r>
+            <w:r>
+              <w:rPr>
+                <w:b/>
+                <w:bCs/>
+              </w:rPr>
+              <w:t>chain_managers can see all posts related to all outlets of their chains</w:t>
+            </w:r>
+            <w:r>
+              <w:rPr/>
+              <w:t>. CAPABILITY to be added in authentication and authorization phase.</w:t>
             </w:r>
           </w:p>
         </w:tc>
@@ -1311,7 +1333,7 @@
         </w:tc>
         <w:tc>
           <w:tcPr>
-            <w:tcW w:w="1607" w:type="dxa"/>
+            <w:tcW w:w="1608" w:type="dxa"/>
             <w:tcBorders>
               <w:start w:val="single" w:sz="4" w:space="0" w:color="000000"/>
               <w:bottom w:val="single" w:sz="4" w:space="0" w:color="000000"/>
@@ -1332,7 +1354,7 @@
         </w:tc>
         <w:tc>
           <w:tcPr>
-            <w:tcW w:w="1605" w:type="dxa"/>
+            <w:tcW w:w="1604" w:type="dxa"/>
             <w:tcBorders>
               <w:start w:val="single" w:sz="4" w:space="0" w:color="000000"/>
               <w:bottom w:val="single" w:sz="4" w:space="0" w:color="000000"/>
@@ -1686,9 +1708,9 @@
         <w:jc w:val="both"/>
         <w:rPr/>
       </w:pPr>
-      <w:bookmarkStart w:id="7" w:name="__DdeLink__194_3029720114"/>
+      <w:bookmarkStart w:id="7" w:name="__DdeLink__187_3029720114"/>
       <w:bookmarkStart w:id="8" w:name="__DdeLink__190_3029720114"/>
-      <w:bookmarkStart w:id="9" w:name="__DdeLink__187_3029720114"/>
+      <w:bookmarkStart w:id="9" w:name="__DdeLink__194_3029720114"/>
       <w:r>
         <w:rPr/>
         <w:t>Perform tests on mostly on Domain Integrity and Entity integrity with just very few tests on Referential Integrity.</w:t>
@@ -1719,7 +1741,10 @@
         </w:rPr>
       </w:pPr>
       <w:r>
-        <w:rPr/>
+        <w:rPr>
+          <w:b/>
+          <w:bCs/>
+        </w:rPr>
       </w:r>
     </w:p>
     <w:p>
@@ -1733,7 +1758,10 @@
         </w:rPr>
       </w:pPr>
       <w:r>
-        <w:rPr/>
+        <w:rPr>
+          <w:b/>
+          <w:bCs/>
+        </w:rPr>
       </w:r>
     </w:p>
     <w:p>
@@ -1747,7 +1775,10 @@
         </w:rPr>
       </w:pPr>
       <w:r>
-        <w:rPr/>
+        <w:rPr>
+          <w:b/>
+          <w:bCs/>
+        </w:rPr>
       </w:r>
     </w:p>
     <w:p>
@@ -1761,7 +1792,10 @@
         </w:rPr>
       </w:pPr>
       <w:r>
-        <w:rPr/>
+        <w:rPr>
+          <w:b/>
+          <w:bCs/>
+        </w:rPr>
       </w:r>
     </w:p>
     <w:p>
@@ -1998,7 +2032,10 @@
         </w:rPr>
       </w:pPr>
       <w:r>
-        <w:rPr/>
+        <w:rPr>
+          <w:b w:val="false"/>
+          <w:bCs w:val="false"/>
+        </w:rPr>
       </w:r>
     </w:p>
     <w:p>
@@ -2085,8 +2122,8 @@
         </w:tblCellMar>
       </w:tblPr>
       <w:tblGrid>
-        <w:gridCol w:w="1920"/>
-        <w:gridCol w:w="1032"/>
+        <w:gridCol w:w="1919"/>
+        <w:gridCol w:w="1033"/>
         <w:gridCol w:w="6686"/>
       </w:tblGrid>
       <w:tr>
@@ -2095,7 +2132,7 @@
         </w:trPr>
         <w:tc>
           <w:tcPr>
-            <w:tcW w:w="1920" w:type="dxa"/>
+            <w:tcW w:w="1919" w:type="dxa"/>
             <w:tcBorders/>
             <w:vAlign w:val="center"/>
           </w:tcPr>
@@ -2112,7 +2149,7 @@
         </w:tc>
         <w:tc>
           <w:tcPr>
-            <w:tcW w:w="1032" w:type="dxa"/>
+            <w:tcW w:w="1033" w:type="dxa"/>
             <w:tcBorders/>
             <w:vAlign w:val="center"/>
           </w:tcPr>
@@ -2149,7 +2186,7 @@
         <w:trPr/>
         <w:tc>
           <w:tcPr>
-            <w:tcW w:w="1920" w:type="dxa"/>
+            <w:tcW w:w="1919" w:type="dxa"/>
             <w:tcBorders/>
             <w:vAlign w:val="center"/>
           </w:tcPr>
@@ -2166,7 +2203,7 @@
         </w:tc>
         <w:tc>
           <w:tcPr>
-            <w:tcW w:w="1032" w:type="dxa"/>
+            <w:tcW w:w="1033" w:type="dxa"/>
             <w:tcBorders/>
             <w:vAlign w:val="center"/>
           </w:tcPr>
@@ -2203,7 +2240,7 @@
         <w:trPr/>
         <w:tc>
           <w:tcPr>
-            <w:tcW w:w="1920" w:type="dxa"/>
+            <w:tcW w:w="1919" w:type="dxa"/>
             <w:tcBorders/>
             <w:vAlign w:val="center"/>
           </w:tcPr>
@@ -2220,7 +2257,7 @@
         </w:tc>
         <w:tc>
           <w:tcPr>
-            <w:tcW w:w="1032" w:type="dxa"/>
+            <w:tcW w:w="1033" w:type="dxa"/>
             <w:tcBorders/>
             <w:vAlign w:val="center"/>
           </w:tcPr>
@@ -2257,7 +2294,7 @@
         <w:trPr/>
         <w:tc>
           <w:tcPr>
-            <w:tcW w:w="1920" w:type="dxa"/>
+            <w:tcW w:w="1919" w:type="dxa"/>
             <w:tcBorders/>
             <w:vAlign w:val="center"/>
           </w:tcPr>
@@ -2274,7 +2311,7 @@
         </w:tc>
         <w:tc>
           <w:tcPr>
-            <w:tcW w:w="1032" w:type="dxa"/>
+            <w:tcW w:w="1033" w:type="dxa"/>
             <w:tcBorders/>
             <w:vAlign w:val="center"/>
           </w:tcPr>
@@ -6897,7 +6934,6 @@
     </w:lvl>
     <w:lvl w:ilvl="1">
       <w:start w:val="1"/>
-      <w:pStyle w:val="Heading2"/>
       <w:numFmt w:val="none"/>
       <w:suff w:val="nothing"/>
       <w:lvlText w:val=""/>

</xml_diff>